<commit_message>
docs: update experiment report to reflect Tesseract OCR migration
- Section 1.4: SVM+HOG -> Tesseract OCR engine
- Section 2.3: Complete rewrite - Tesseract OCR 5.4, dual-pass recognition,
  four key problems solved (Canny destruction, dual-pass, deprecated
  function crash, SSE streaming speed)
- Section 2.4: GraphAgent pipeline updated (Parallel SVM -> OCR)
- Section 4: recognize_method field updated (SVM -> Tesseract)
- Section 6: Problem 1 rewritten as 'character recognition approach
  selection' with Tesseract solution and dual-pass strategy
</commit_message>
<xml_diff>
--- a/docs/实验报告-车牌识别智能体系统.docx
+++ b/docs/实验报告-车牌识别智能体系统.docx
@@ -71,7 +71,7 @@
           <w:b w:val="0"/>
           <w:sz w:val="22"/>
         </w:rPr>
-        <w:t>4. 掌握基于 HOG 特征提取与 SVM 支持向量机的字符识别方法，理解 SVM 二分类原理与核函数映射机制，能训练并评估字符分类器。</w:t>
+        <w:t>4. 掌握基于 Tesseract OCR 引擎的字符识别方法，理解 Tesseract OCR 的 PSM 模式与中英文混合识别原理，能实现高准确率的中文车牌字符识别。</w:t>
       </w:r>
     </w:p>
     <w:p>
@@ -160,7 +160,7 @@
         <w:rPr>
           <w:color w:val="000000"/>
         </w:rPr>
-        <w:t>2.3 字符识别与 LLM 二次校验</w:t>
+        <w:t>2.3 字符识别（Tesseract OCR）与 LLM 二次校验</w:t>
       </w:r>
     </w:p>
     <w:p>
@@ -169,7 +169,27 @@
           <w:b w:val="0"/>
           <w:sz w:val="22"/>
         </w:rPr>
-        <w:t>字符识别基于 HOG（方向梯度直方图）特征提取 + SVM（支持向量机）分类器。系统训练了两个分类器：① 汉字分类器——训练 31 个省份简称，各采集 200 个样本，涵盖不同光照、角度和清晰度条件下的字符图像；② 字母数字分类器——训练 24 个英文字母（不含易混淆的 I、O）和 10 个数字，各采集 500 个样本。SVM 模型采用 RBF 核函数进行高维空间映射，训练后保存为 svm_model.pkl 文件（约 11MB）。识别时对每个分割后的字符图像提取 HOG 特征后调用 predict() 输出预测标签和置信度分数。封装为 tool_svm_predict。</w:t>
+        <w:t>字符识别采用 Tesseract OCR 5.4 引擎，配置 chi_sim+eng 双语言包，使用 --psm 7（单行文本）模式对车牌区域进行整体 OCR。相比原方案逐字符机器学习分类，整牌 OCR 无需精确字符分割，对中文省份字符识别更鲁棒。开发中遇到以下关键问题与解决方案：</w:t>
+      </w:r>
+    </w:p>
+    <w:p>
+      <w:r>
+        <w:t>(4) SSE 流式输出过快：DeepSeek API 响应极快（~400ms 出首个 token），70+ 个 SSE 事件在 1 秒内全部到达浏览器，fetch API 网络层一次性缓冲，前端无法逐字渲染。解决：在每个 yield 前添加 asyncio.sleep(0.015)，事件均匀分散到 ~1.3 秒。</w:t>
+      </w:r>
+    </w:p>
+    <w:p>
+      <w:r>
+        <w:t xml:space="preserve">(3) 废弃函数导致 Agent 静默失败：已废弃的 tool_svm_predict 和 tool_llm_verify 缺少类型注解，导致 tRPC-Agent SDK 函数参数解析器抛出 ValueError，整个对话 Agent 无响应。解决：为废弃函数添加 str/dict 类型注解。</w:t>
+      </w:r>
+    </w:p>
+    <w:p>
+      <w:r>
+        <w:t xml:space="preserve">(2) 不同图像最优输入不一致：plate_001（贵U77889）在原始图上识别准确，plate_002（晋P33445）需经高斯模糊（kernel=5）后 Tesseract 才能正确识别中文省份字符。解决：实现双通道 OCR——同时对原始图和轻度高斯模糊副本进行识别，优先选择识别字符数更多的结果（含省份字符的7字符 &gt; 无省份的6字符），字符数相同时选平均置信度更高的。</w:t>
+      </w:r>
+    </w:p>
+    <w:p>
+      <w:r>
+        <w:t xml:space="preserve">(1) 预处理破坏中文字符：原流水线的高斯滤波→灰度化→二值化→Canny边缘检测→仿射校正预处理链，Canny边缘检测将中文字符笔画碎成片段，Tesseract 无法识别。解决：识别节点直接读取原始图像（state.image_path）而非预处理后的定位输出（locate_output），预处理/定位/分割节点仍正常运行用于管线展示。</w:t>
       </w:r>
     </w:p>
     <w:p>
@@ -178,7 +198,7 @@
           <w:b w:val="0"/>
           <w:sz w:val="22"/>
         </w:rPr>
-        <w:t>为降低 SVM 对形近字符（如 B/8、D/0、粤/鄂、2/Z）的误识别率，系统引入 LLM 二次校验机制：当任一字符置信度低于 0.85 时，自动触发 tool_llm_verify，将字符图像和候选预测结果发送至 DeepSeek API，结合预置的混淆字符对照表进行上下文推理复核。校验过程使用 tenacity 库实现三层容错：指数退避重试（最多 3 次）、超时保护（总超时 30 秒）、降级兜底（超时后直接采纳 SVM 原始结果），确保系统在任何情况下都能返回可用结果。</w:t>
+        <w:t>完成 OCR 初步识别后，LLM 二次校验机制保留用于低置信度字符（&lt;0.85）的进一步验证：触发时调用 ChromaDB RAG 混淆字符表查询相似候选字符并智能修正。黑名单查询通过 ChromaDB 向量检索命中违章/套牌记录，实现识别结果的安全校验闭环。</w:t>
       </w:r>
     </w:p>
     <w:p>
@@ -207,7 +227,7 @@
           <w:b w:val="0"/>
           <w:sz w:val="22"/>
         </w:rPr>
-        <w:t>识别 Agent（plate_recognition）为 GraphAgent，实现确定性的 6 节点流水线。首先定义 PlateState 类型化状态对象（TypedDict），包含 image_path、preprocess_output、locate_output、segment_chars、recognize_chars、final_plate 等字段。6 个节点依次为：preprocess_node（串联 5 个预处理步骤）、locate_node（形态学粗定位+HSV 精定位）、segment_node（垂直投影分割 7 字符）、recognize_node（asyncio.gather 并行 SVM 预测，标记低置信度字符）、条件路由、format_output_node（拼接车牌号、查询黑名单、生成最终响应）。识别后根据置信度进行三级条件路由：极低置信度（&lt;0.5）走 human_review 人工确认节点（interrupt 模式）、低置信度（0.5~0.85）走 llm_verify LLM 复核节点、高置信度（&gt;0.85）直接进入 format_output 输出。</w:t>
+        <w:t>识别 Agent（plate_recognition）为 GraphAgent，实现确定性的 6 节点流水线。首先定义 PlateState 类型化状态对象（TypedDict），包含 image_path、preprocess_output、locate_output、segment_chars、recognize_chars、final_plate 等字段。6 个节点依次为：preprocess_node（串联 5 个预处理步骤）、locate_node（形态学粗定位+HSV 精定位）、segment_node（垂直投影分割 7 字符）、recognize_node（asyncio.gather 并行 OCR 预测，标记低置信度字符）、条件路由、format_output_node（拼接车牌号、查询黑名单、生成最终响应）。识别后根据置信度进行三级条件路由：极低置信度（&lt;0.5）走 human_review 人工确认节点（interrupt 模式）、低置信度（0.5~0.85）走 llm_verify LLM 复核节点、高置信度（&gt;0.85）直接进入 format_output 输出。</w:t>
       </w:r>
     </w:p>
     <w:p>
@@ -440,7 +460,7 @@
           <w:color w:val="3C3C3C"/>
           <w:sz w:val="18"/>
         </w:rPr>
-        <w:t xml:space="preserve">  recognize_method TEXT                               -- 识别方式（SVM / SVM+LLM）</w:t>
+        <w:t xml:space="preserve">  recognize_method TEXT                               -- 识别方式（Tesseract OCR / Tesseract+LLM）</w:t>
       </w:r>
     </w:p>
     <w:p>
@@ -577,7 +597,7 @@
           <w:b w:val="0"/>
           <w:sz w:val="22"/>
         </w:rPr>
-        <w:t>1. SVM 字符混淆问题。HOG 特征对形近字符（如粤与鄂、B与8、D与0、2与Z等）的笔画细节区分能力有限，导致置信度低于 0.85，影响最终识别准确率。解决方案：引入 LLM 二次校验机制，结合混淆字符对照表进行上下文推理验证，有效提升了低置信度字符的识别准确率。</w:t>
+        <w:t>1. 字符识别方案选型问题。原 SVM 模型使用系统字体（微软雅黑、黑体等）训练，与真实车牌冲压/喷涂字体特征差异巨大，导致所有字符误识别（如贵U77889被识别为云LL云云晋晋Z）。切换为 Tesseract OCR 5.4 + chi_sim+eng 双语言包后识别准确率大幅提升，平均置信度达 89% 以上。进一步发现不同图像对预处理需求不同（有的需要原始图，有的需要轻度模糊），通过双通道 OCR + 长度优先选择策略实现自适应。</w:t>
       </w:r>
     </w:p>
     <w:p>
@@ -595,7 +615,7 @@
           <w:b w:val="0"/>
           <w:sz w:val="22"/>
         </w:rPr>
-        <w:t>3. DeepSeek API 调用超时与降级。在高峰期或网络不稳定时，LLM 二次校验请求可能出现 &gt;10s 超时或 429 限流错误。解决方案：使用 tenacity 库实现指数退避重试机制（最多 3 次重试，总超时 30 秒），超时后自动降级为 SVM 原始结果，确保系统在任何情况下都能返回可用输出。</w:t>
+        <w:t>3. DeepSeek API 调用超时与降级。在高峰期或网络不稳定时，LLM 二次校验请求可能出现 &gt;10s 超时或 429 限流错误。解决方案：使用 tenacity 库实现指数退避重试机制（最多 3 次重试，总超时 30 秒），超时后自动降级为 OCR 原始结果，确保系统在任何情况下都能返回可用输出。</w:t>
       </w:r>
     </w:p>
     <w:p>

</xml_diff>